<commit_message>
Make ASIN cells clickable links in XLSX and DOCX
- XLSX «Кандидаты»: ASIN → Amazon product page + new «Keepa (график)»
  link column per row.
- XLSX «Юнит-экономика»: add ASIN column linking to Amazon for verified rows.
- DOCX candidates table: add ASIN column with Amazon hyperlinks (add_hyperlink
  helper).
</commit_message>
<xml_diff>
--- a/health_uae_analysis/Health_UAE_Report.docx
+++ b/health_uae_analysis/Health_UAE_Report.docx
@@ -694,7 +694,7 @@
           <w:color w:val="1F4E78"/>
           <w:sz w:val="25"/>
         </w:rPr>
-        <w:t>Проверено в Keepa:</w:t>
+        <w:t>Проверено в Keepa (ASIN — кликабельные ссылки на Amazon):</w:t>
       </w:r>
     </w:p>
     <w:tbl>
@@ -705,18 +705,19 @@
         <w:tblLook w:firstColumn="1" w:firstRow="1" w:lastColumn="0" w:lastRow="0" w:noHBand="0" w:noVBand="1" w:val="04A0"/>
       </w:tblPr>
       <w:tblGrid>
-        <w:gridCol w:w="1234"/>
-        <w:gridCol w:w="1234"/>
-        <w:gridCol w:w="1234"/>
-        <w:gridCol w:w="1234"/>
-        <w:gridCol w:w="1234"/>
-        <w:gridCol w:w="1234"/>
-        <w:gridCol w:w="1234"/>
+        <w:gridCol w:w="1080"/>
+        <w:gridCol w:w="1080"/>
+        <w:gridCol w:w="1080"/>
+        <w:gridCol w:w="1080"/>
+        <w:gridCol w:w="1080"/>
+        <w:gridCol w:w="1080"/>
+        <w:gridCol w:w="1080"/>
+        <w:gridCol w:w="1080"/>
       </w:tblGrid>
       <w:tr>
         <w:tc>
           <w:tcPr>
-            <w:tcW w:type="dxa" w:w="2721"/>
+            <w:tcW w:type="dxa" w:w="2494"/>
             <w:shd w:val="clear" w:fill="1F4E78"/>
           </w:tcPr>
           <w:p>
@@ -736,7 +737,7 @@
         </w:tc>
         <w:tc>
           <w:tcPr>
-            <w:tcW w:type="dxa" w:w="1587"/>
+            <w:tcW w:type="dxa" w:w="1474"/>
             <w:shd w:val="clear" w:fill="1F4E78"/>
           </w:tcPr>
           <w:p>
@@ -756,7 +757,27 @@
         </w:tc>
         <w:tc>
           <w:tcPr>
-            <w:tcW w:type="dxa" w:w="1020"/>
+            <w:tcW w:type="dxa" w:w="1361"/>
+            <w:shd w:val="clear" w:fill="1F4E78"/>
+          </w:tcPr>
+          <w:p>
+            <w:pPr>
+              <w:jc w:val="center"/>
+            </w:pPr>
+            <w:r/>
+            <w:r>
+              <w:rPr>
+                <w:b/>
+                <w:color w:val="FFFFFF"/>
+                <w:sz w:val="18"/>
+              </w:rPr>
+              <w:t>ASIN</w:t>
+            </w:r>
+          </w:p>
+        </w:tc>
+        <w:tc>
+          <w:tcPr>
+            <w:tcW w:type="dxa" w:w="907"/>
             <w:shd w:val="clear" w:fill="1F4E78"/>
           </w:tcPr>
           <w:p>
@@ -776,7 +797,7 @@
         </w:tc>
         <w:tc>
           <w:tcPr>
-            <w:tcW w:type="dxa" w:w="1361"/>
+            <w:tcW w:type="dxa" w:w="1247"/>
             <w:shd w:val="clear" w:fill="1F4E78"/>
           </w:tcPr>
           <w:p>
@@ -796,7 +817,7 @@
         </w:tc>
         <w:tc>
           <w:tcPr>
-            <w:tcW w:type="dxa" w:w="1020"/>
+            <w:tcW w:type="dxa" w:w="907"/>
             <w:shd w:val="clear" w:fill="1F4E78"/>
           </w:tcPr>
           <w:p>
@@ -816,7 +837,7 @@
         </w:tc>
         <w:tc>
           <w:tcPr>
-            <w:tcW w:type="dxa" w:w="1814"/>
+            <w:tcW w:type="dxa" w:w="1701"/>
             <w:shd w:val="clear" w:fill="1F4E78"/>
           </w:tcPr>
           <w:p>
@@ -836,7 +857,7 @@
         </w:tc>
         <w:tc>
           <w:tcPr>
-            <w:tcW w:type="dxa" w:w="1134"/>
+            <w:tcW w:type="dxa" w:w="1077"/>
             <w:shd w:val="clear" w:fill="1F4E78"/>
           </w:tcPr>
           <w:p>
@@ -858,7 +879,7 @@
       <w:tr>
         <w:tc>
           <w:tcPr>
-            <w:tcW w:type="dxa" w:w="2721"/>
+            <w:tcW w:type="dxa" w:w="2494"/>
           </w:tcPr>
           <w:p>
             <w:pPr>
@@ -876,7 +897,7 @@
         </w:tc>
         <w:tc>
           <w:tcPr>
-            <w:tcW w:type="dxa" w:w="1587"/>
+            <w:tcW w:type="dxa" w:w="1474"/>
           </w:tcPr>
           <w:p>
             <w:pPr>
@@ -894,7 +915,25 @@
         </w:tc>
         <w:tc>
           <w:tcPr>
-            <w:tcW w:type="dxa" w:w="1020"/>
+            <w:tcW w:type="dxa" w:w="1361"/>
+          </w:tcPr>
+          <w:p>
+            <w:r/>
+            <w:hyperlink r:id="rId9">
+              <w:r>
+                <w:rPr>
+                  <w:color w:val="0563C1"/>
+                  <w:u w:val="single"/>
+                  <w:sz w:val="18"/>
+                </w:rPr>
+                <w:t>B0DNFTL63F</w:t>
+              </w:r>
+            </w:hyperlink>
+          </w:p>
+        </w:tc>
+        <w:tc>
+          <w:tcPr>
+            <w:tcW w:type="dxa" w:w="907"/>
           </w:tcPr>
           <w:p>
             <w:pPr>
@@ -912,7 +951,7 @@
         </w:tc>
         <w:tc>
           <w:tcPr>
-            <w:tcW w:type="dxa" w:w="1361"/>
+            <w:tcW w:type="dxa" w:w="1247"/>
           </w:tcPr>
           <w:p>
             <w:pPr>
@@ -930,7 +969,7 @@
         </w:tc>
         <w:tc>
           <w:tcPr>
-            <w:tcW w:type="dxa" w:w="1020"/>
+            <w:tcW w:type="dxa" w:w="907"/>
           </w:tcPr>
           <w:p>
             <w:pPr>
@@ -948,7 +987,7 @@
         </w:tc>
         <w:tc>
           <w:tcPr>
-            <w:tcW w:type="dxa" w:w="1814"/>
+            <w:tcW w:type="dxa" w:w="1701"/>
           </w:tcPr>
           <w:p>
             <w:pPr>
@@ -966,7 +1005,7 @@
         </w:tc>
         <w:tc>
           <w:tcPr>
-            <w:tcW w:type="dxa" w:w="1134"/>
+            <w:tcW w:type="dxa" w:w="1077"/>
             <w:shd w:val="clear" w:fill="C6EFCE"/>
           </w:tcPr>
           <w:p>
@@ -987,7 +1026,7 @@
       <w:tr>
         <w:tc>
           <w:tcPr>
-            <w:tcW w:type="dxa" w:w="2721"/>
+            <w:tcW w:type="dxa" w:w="2494"/>
           </w:tcPr>
           <w:p>
             <w:pPr>
@@ -1005,7 +1044,7 @@
         </w:tc>
         <w:tc>
           <w:tcPr>
-            <w:tcW w:type="dxa" w:w="1587"/>
+            <w:tcW w:type="dxa" w:w="1474"/>
           </w:tcPr>
           <w:p>
             <w:pPr>
@@ -1023,7 +1062,25 @@
         </w:tc>
         <w:tc>
           <w:tcPr>
-            <w:tcW w:type="dxa" w:w="1020"/>
+            <w:tcW w:type="dxa" w:w="1361"/>
+          </w:tcPr>
+          <w:p>
+            <w:r/>
+            <w:hyperlink r:id="rId10">
+              <w:r>
+                <w:rPr>
+                  <w:color w:val="0563C1"/>
+                  <w:u w:val="single"/>
+                  <w:sz w:val="18"/>
+                </w:rPr>
+                <w:t>B08P27LHJ4</w:t>
+              </w:r>
+            </w:hyperlink>
+          </w:p>
+        </w:tc>
+        <w:tc>
+          <w:tcPr>
+            <w:tcW w:type="dxa" w:w="907"/>
           </w:tcPr>
           <w:p>
             <w:pPr>
@@ -1041,7 +1098,7 @@
         </w:tc>
         <w:tc>
           <w:tcPr>
-            <w:tcW w:type="dxa" w:w="1361"/>
+            <w:tcW w:type="dxa" w:w="1247"/>
           </w:tcPr>
           <w:p>
             <w:pPr>
@@ -1059,7 +1116,7 @@
         </w:tc>
         <w:tc>
           <w:tcPr>
-            <w:tcW w:type="dxa" w:w="1020"/>
+            <w:tcW w:type="dxa" w:w="907"/>
           </w:tcPr>
           <w:p>
             <w:pPr>
@@ -1077,7 +1134,7 @@
         </w:tc>
         <w:tc>
           <w:tcPr>
-            <w:tcW w:type="dxa" w:w="1814"/>
+            <w:tcW w:type="dxa" w:w="1701"/>
           </w:tcPr>
           <w:p>
             <w:pPr>
@@ -1095,7 +1152,7 @@
         </w:tc>
         <w:tc>
           <w:tcPr>
-            <w:tcW w:type="dxa" w:w="1134"/>
+            <w:tcW w:type="dxa" w:w="1077"/>
             <w:shd w:val="clear" w:fill="C6EFCE"/>
           </w:tcPr>
           <w:p>
@@ -1116,7 +1173,7 @@
       <w:tr>
         <w:tc>
           <w:tcPr>
-            <w:tcW w:type="dxa" w:w="2721"/>
+            <w:tcW w:type="dxa" w:w="2494"/>
           </w:tcPr>
           <w:p>
             <w:pPr>
@@ -1134,7 +1191,7 @@
         </w:tc>
         <w:tc>
           <w:tcPr>
-            <w:tcW w:type="dxa" w:w="1587"/>
+            <w:tcW w:type="dxa" w:w="1474"/>
           </w:tcPr>
           <w:p>
             <w:pPr>
@@ -1152,7 +1209,25 @@
         </w:tc>
         <w:tc>
           <w:tcPr>
-            <w:tcW w:type="dxa" w:w="1020"/>
+            <w:tcW w:type="dxa" w:w="1361"/>
+          </w:tcPr>
+          <w:p>
+            <w:r/>
+            <w:hyperlink r:id="rId11">
+              <w:r>
+                <w:rPr>
+                  <w:color w:val="0563C1"/>
+                  <w:u w:val="single"/>
+                  <w:sz w:val="18"/>
+                </w:rPr>
+                <w:t>B0DR3BYKWC</w:t>
+              </w:r>
+            </w:hyperlink>
+          </w:p>
+        </w:tc>
+        <w:tc>
+          <w:tcPr>
+            <w:tcW w:type="dxa" w:w="907"/>
           </w:tcPr>
           <w:p>
             <w:pPr>
@@ -1170,7 +1245,7 @@
         </w:tc>
         <w:tc>
           <w:tcPr>
-            <w:tcW w:type="dxa" w:w="1361"/>
+            <w:tcW w:type="dxa" w:w="1247"/>
           </w:tcPr>
           <w:p>
             <w:pPr>
@@ -1188,7 +1263,7 @@
         </w:tc>
         <w:tc>
           <w:tcPr>
-            <w:tcW w:type="dxa" w:w="1020"/>
+            <w:tcW w:type="dxa" w:w="907"/>
           </w:tcPr>
           <w:p>
             <w:pPr>
@@ -1206,7 +1281,7 @@
         </w:tc>
         <w:tc>
           <w:tcPr>
-            <w:tcW w:type="dxa" w:w="1814"/>
+            <w:tcW w:type="dxa" w:w="1701"/>
           </w:tcPr>
           <w:p>
             <w:pPr>
@@ -1224,7 +1299,7 @@
         </w:tc>
         <w:tc>
           <w:tcPr>
-            <w:tcW w:type="dxa" w:w="1134"/>
+            <w:tcW w:type="dxa" w:w="1077"/>
             <w:shd w:val="clear" w:fill="C6EFCE"/>
           </w:tcPr>
           <w:p>
@@ -1245,7 +1320,7 @@
       <w:tr>
         <w:tc>
           <w:tcPr>
-            <w:tcW w:type="dxa" w:w="2721"/>
+            <w:tcW w:type="dxa" w:w="2494"/>
           </w:tcPr>
           <w:p>
             <w:pPr>
@@ -1263,7 +1338,7 @@
         </w:tc>
         <w:tc>
           <w:tcPr>
-            <w:tcW w:type="dxa" w:w="1587"/>
+            <w:tcW w:type="dxa" w:w="1474"/>
           </w:tcPr>
           <w:p>
             <w:pPr>
@@ -1281,7 +1356,25 @@
         </w:tc>
         <w:tc>
           <w:tcPr>
-            <w:tcW w:type="dxa" w:w="1020"/>
+            <w:tcW w:type="dxa" w:w="1361"/>
+          </w:tcPr>
+          <w:p>
+            <w:r/>
+            <w:hyperlink r:id="rId12">
+              <w:r>
+                <w:rPr>
+                  <w:color w:val="0563C1"/>
+                  <w:u w:val="single"/>
+                  <w:sz w:val="18"/>
+                </w:rPr>
+                <w:t>B0DCDPBZX2</w:t>
+              </w:r>
+            </w:hyperlink>
+          </w:p>
+        </w:tc>
+        <w:tc>
+          <w:tcPr>
+            <w:tcW w:type="dxa" w:w="907"/>
           </w:tcPr>
           <w:p>
             <w:pPr>
@@ -1299,7 +1392,7 @@
         </w:tc>
         <w:tc>
           <w:tcPr>
-            <w:tcW w:type="dxa" w:w="1361"/>
+            <w:tcW w:type="dxa" w:w="1247"/>
           </w:tcPr>
           <w:p>
             <w:pPr>
@@ -1317,7 +1410,7 @@
         </w:tc>
         <w:tc>
           <w:tcPr>
-            <w:tcW w:type="dxa" w:w="1020"/>
+            <w:tcW w:type="dxa" w:w="907"/>
           </w:tcPr>
           <w:p>
             <w:pPr>
@@ -1335,7 +1428,7 @@
         </w:tc>
         <w:tc>
           <w:tcPr>
-            <w:tcW w:type="dxa" w:w="1814"/>
+            <w:tcW w:type="dxa" w:w="1701"/>
           </w:tcPr>
           <w:p>
             <w:pPr>
@@ -1353,7 +1446,7 @@
         </w:tc>
         <w:tc>
           <w:tcPr>
-            <w:tcW w:type="dxa" w:w="1134"/>
+            <w:tcW w:type="dxa" w:w="1077"/>
             <w:shd w:val="clear" w:fill="C6EFCE"/>
           </w:tcPr>
           <w:p>
@@ -1374,7 +1467,7 @@
       <w:tr>
         <w:tc>
           <w:tcPr>
-            <w:tcW w:type="dxa" w:w="2721"/>
+            <w:tcW w:type="dxa" w:w="2494"/>
           </w:tcPr>
           <w:p>
             <w:pPr>
@@ -1392,7 +1485,7 @@
         </w:tc>
         <w:tc>
           <w:tcPr>
-            <w:tcW w:type="dxa" w:w="1587"/>
+            <w:tcW w:type="dxa" w:w="1474"/>
           </w:tcPr>
           <w:p>
             <w:pPr>
@@ -1410,7 +1503,25 @@
         </w:tc>
         <w:tc>
           <w:tcPr>
-            <w:tcW w:type="dxa" w:w="1020"/>
+            <w:tcW w:type="dxa" w:w="1361"/>
+          </w:tcPr>
+          <w:p>
+            <w:r/>
+            <w:hyperlink r:id="rId13">
+              <w:r>
+                <w:rPr>
+                  <w:color w:val="0563C1"/>
+                  <w:u w:val="single"/>
+                  <w:sz w:val="18"/>
+                </w:rPr>
+                <w:t>B000MMYI8G</w:t>
+              </w:r>
+            </w:hyperlink>
+          </w:p>
+        </w:tc>
+        <w:tc>
+          <w:tcPr>
+            <w:tcW w:type="dxa" w:w="907"/>
           </w:tcPr>
           <w:p>
             <w:pPr>
@@ -1428,7 +1539,7 @@
         </w:tc>
         <w:tc>
           <w:tcPr>
-            <w:tcW w:type="dxa" w:w="1361"/>
+            <w:tcW w:type="dxa" w:w="1247"/>
           </w:tcPr>
           <w:p>
             <w:pPr>
@@ -1446,7 +1557,7 @@
         </w:tc>
         <w:tc>
           <w:tcPr>
-            <w:tcW w:type="dxa" w:w="1020"/>
+            <w:tcW w:type="dxa" w:w="907"/>
           </w:tcPr>
           <w:p>
             <w:pPr>
@@ -1464,7 +1575,7 @@
         </w:tc>
         <w:tc>
           <w:tcPr>
-            <w:tcW w:type="dxa" w:w="1814"/>
+            <w:tcW w:type="dxa" w:w="1701"/>
           </w:tcPr>
           <w:p>
             <w:pPr>
@@ -1482,7 +1593,7 @@
         </w:tc>
         <w:tc>
           <w:tcPr>
-            <w:tcW w:type="dxa" w:w="1134"/>
+            <w:tcW w:type="dxa" w:w="1077"/>
             <w:shd w:val="clear" w:fill="FFEB9C"/>
           </w:tcPr>
           <w:p>
@@ -1503,7 +1614,7 @@
       <w:tr>
         <w:tc>
           <w:tcPr>
-            <w:tcW w:type="dxa" w:w="2721"/>
+            <w:tcW w:type="dxa" w:w="2494"/>
           </w:tcPr>
           <w:p>
             <w:pPr>
@@ -1521,7 +1632,7 @@
         </w:tc>
         <w:tc>
           <w:tcPr>
-            <w:tcW w:type="dxa" w:w="1587"/>
+            <w:tcW w:type="dxa" w:w="1474"/>
           </w:tcPr>
           <w:p>
             <w:pPr>
@@ -1539,7 +1650,25 @@
         </w:tc>
         <w:tc>
           <w:tcPr>
-            <w:tcW w:type="dxa" w:w="1020"/>
+            <w:tcW w:type="dxa" w:w="1361"/>
+          </w:tcPr>
+          <w:p>
+            <w:r/>
+            <w:hyperlink r:id="rId14">
+              <w:r>
+                <w:rPr>
+                  <w:color w:val="0563C1"/>
+                  <w:u w:val="single"/>
+                  <w:sz w:val="18"/>
+                </w:rPr>
+                <w:t>B0C4MMPCQH</w:t>
+              </w:r>
+            </w:hyperlink>
+          </w:p>
+        </w:tc>
+        <w:tc>
+          <w:tcPr>
+            <w:tcW w:type="dxa" w:w="907"/>
           </w:tcPr>
           <w:p>
             <w:pPr>
@@ -1557,7 +1686,7 @@
         </w:tc>
         <w:tc>
           <w:tcPr>
-            <w:tcW w:type="dxa" w:w="1361"/>
+            <w:tcW w:type="dxa" w:w="1247"/>
           </w:tcPr>
           <w:p>
             <w:pPr>
@@ -1575,7 +1704,7 @@
         </w:tc>
         <w:tc>
           <w:tcPr>
-            <w:tcW w:type="dxa" w:w="1020"/>
+            <w:tcW w:type="dxa" w:w="907"/>
           </w:tcPr>
           <w:p>
             <w:pPr>
@@ -1593,7 +1722,7 @@
         </w:tc>
         <w:tc>
           <w:tcPr>
-            <w:tcW w:type="dxa" w:w="1814"/>
+            <w:tcW w:type="dxa" w:w="1701"/>
           </w:tcPr>
           <w:p>
             <w:pPr>
@@ -1611,7 +1740,7 @@
         </w:tc>
         <w:tc>
           <w:tcPr>
-            <w:tcW w:type="dxa" w:w="1134"/>
+            <w:tcW w:type="dxa" w:w="1077"/>
             <w:shd w:val="clear" w:fill="FFEB9C"/>
           </w:tcPr>
           <w:p>
@@ -1632,7 +1761,7 @@
       <w:tr>
         <w:tc>
           <w:tcPr>
-            <w:tcW w:type="dxa" w:w="2721"/>
+            <w:tcW w:type="dxa" w:w="2494"/>
           </w:tcPr>
           <w:p>
             <w:pPr>
@@ -1650,7 +1779,7 @@
         </w:tc>
         <w:tc>
           <w:tcPr>
-            <w:tcW w:type="dxa" w:w="1587"/>
+            <w:tcW w:type="dxa" w:w="1474"/>
           </w:tcPr>
           <w:p>
             <w:pPr>
@@ -1668,7 +1797,25 @@
         </w:tc>
         <w:tc>
           <w:tcPr>
-            <w:tcW w:type="dxa" w:w="1020"/>
+            <w:tcW w:type="dxa" w:w="1361"/>
+          </w:tcPr>
+          <w:p>
+            <w:r/>
+            <w:hyperlink r:id="rId15">
+              <w:r>
+                <w:rPr>
+                  <w:color w:val="0563C1"/>
+                  <w:u w:val="single"/>
+                  <w:sz w:val="18"/>
+                </w:rPr>
+                <w:t>B0BGXMXNRD</w:t>
+              </w:r>
+            </w:hyperlink>
+          </w:p>
+        </w:tc>
+        <w:tc>
+          <w:tcPr>
+            <w:tcW w:type="dxa" w:w="907"/>
           </w:tcPr>
           <w:p>
             <w:pPr>
@@ -1686,7 +1833,7 @@
         </w:tc>
         <w:tc>
           <w:tcPr>
-            <w:tcW w:type="dxa" w:w="1361"/>
+            <w:tcW w:type="dxa" w:w="1247"/>
           </w:tcPr>
           <w:p>
             <w:pPr>
@@ -1704,7 +1851,7 @@
         </w:tc>
         <w:tc>
           <w:tcPr>
-            <w:tcW w:type="dxa" w:w="1020"/>
+            <w:tcW w:type="dxa" w:w="907"/>
           </w:tcPr>
           <w:p>
             <w:pPr>
@@ -1722,7 +1869,7 @@
         </w:tc>
         <w:tc>
           <w:tcPr>
-            <w:tcW w:type="dxa" w:w="1814"/>
+            <w:tcW w:type="dxa" w:w="1701"/>
           </w:tcPr>
           <w:p>
             <w:pPr>
@@ -1740,7 +1887,7 @@
         </w:tc>
         <w:tc>
           <w:tcPr>
-            <w:tcW w:type="dxa" w:w="1134"/>
+            <w:tcW w:type="dxa" w:w="1077"/>
             <w:shd w:val="clear" w:fill="FFC7CE"/>
           </w:tcPr>
           <w:p>
@@ -1761,7 +1908,7 @@
       <w:tr>
         <w:tc>
           <w:tcPr>
-            <w:tcW w:type="dxa" w:w="2721"/>
+            <w:tcW w:type="dxa" w:w="2494"/>
           </w:tcPr>
           <w:p>
             <w:pPr>
@@ -1779,7 +1926,7 @@
         </w:tc>
         <w:tc>
           <w:tcPr>
-            <w:tcW w:type="dxa" w:w="1587"/>
+            <w:tcW w:type="dxa" w:w="1474"/>
           </w:tcPr>
           <w:p>
             <w:pPr>
@@ -1797,7 +1944,25 @@
         </w:tc>
         <w:tc>
           <w:tcPr>
-            <w:tcW w:type="dxa" w:w="1020"/>
+            <w:tcW w:type="dxa" w:w="1361"/>
+          </w:tcPr>
+          <w:p>
+            <w:r/>
+            <w:hyperlink r:id="rId16">
+              <w:r>
+                <w:rPr>
+                  <w:color w:val="0563C1"/>
+                  <w:u w:val="single"/>
+                  <w:sz w:val="18"/>
+                </w:rPr>
+                <w:t>B0GFFLR222</w:t>
+              </w:r>
+            </w:hyperlink>
+          </w:p>
+        </w:tc>
+        <w:tc>
+          <w:tcPr>
+            <w:tcW w:type="dxa" w:w="907"/>
           </w:tcPr>
           <w:p>
             <w:pPr>
@@ -1815,7 +1980,7 @@
         </w:tc>
         <w:tc>
           <w:tcPr>
-            <w:tcW w:type="dxa" w:w="1361"/>
+            <w:tcW w:type="dxa" w:w="1247"/>
           </w:tcPr>
           <w:p>
             <w:pPr>
@@ -1833,7 +1998,7 @@
         </w:tc>
         <w:tc>
           <w:tcPr>
-            <w:tcW w:type="dxa" w:w="1020"/>
+            <w:tcW w:type="dxa" w:w="907"/>
           </w:tcPr>
           <w:p>
             <w:pPr>
@@ -1851,7 +2016,7 @@
         </w:tc>
         <w:tc>
           <w:tcPr>
-            <w:tcW w:type="dxa" w:w="1814"/>
+            <w:tcW w:type="dxa" w:w="1701"/>
           </w:tcPr>
           <w:p>
             <w:pPr>
@@ -1869,7 +2034,7 @@
         </w:tc>
         <w:tc>
           <w:tcPr>
-            <w:tcW w:type="dxa" w:w="1134"/>
+            <w:tcW w:type="dxa" w:w="1077"/>
             <w:shd w:val="clear" w:fill="FFC7CE"/>
           </w:tcPr>
           <w:p>
@@ -1896,7 +2061,7 @@
           <w:color w:val="808080"/>
           <w:sz w:val="18"/>
         </w:rPr>
-        <w:t>★ = приоритет для новичка. Полная таблица с ASIN и оценкой спроса ОАЭ — на листе «Кандидаты US→ОАЭ».</w:t>
+        <w:t>★ = приоритет для новичка. ASIN кликабельны (Amazon). Полная таблица с ссылками Amazon + Keepa — на листе «Кандидаты US→ОАЭ» в XLSX.</w:t>
       </w:r>
     </w:p>
     <w:p>

</xml_diff>